<commit_message>
I bersagli che Lighthouse non sa attribuire non si stampano piu'
Su forced-reflow-insight compariva la riga "[senza attributi] - 126 ms": occupa
il posto del bersaglio e non dice a nessuno dove guardare. E' il segnaposto con
cui Lighthouse dichiara di non essere riuscito ad attribuire il tempo a un file,
e nell'audit non c'e' nessun altro riferimento utilizzabile - verificato sui
fixture: la voce ha solo `source` e `reflowTime`.

Ora il segnaposto viene scartato e il bersaglio successivo, se c'e', sale al suo
posto invece di lasciare la lista corta. La misura non si perde: resta nel titolo
del tema e nella riga di evidenza.

Logica condivisa: il riconoscimento sta in core/extract e vale per i bersagli di
tutti e tre i documenti, non solo per la nota.
</commit_message>
<xml_diff>
--- a/docs/esempio-interventi-performance.docx
+++ b/docs/esempio-interventi-performance.docx
@@ -1559,26 +1559,6 @@
           <w:color w:val="1F2328"/>
           <w:sz w:val="19"/>
         </w:rPr>
-        <w:t xml:space="preserve">Su tutti i template:  </w:t>
-      </w:r>
-      <w:r>
-        <w:rPr>
-          <w:color w:val="1F2328"/>
-          <w:sz w:val="19"/>
-        </w:rPr>
-        <w:t>[senza attributi] — 126 ms</w:t>
-      </w:r>
-    </w:p>
-    <w:p>
-      <w:pPr>
-        <w:spacing w:after="60"/>
-      </w:pPr>
-      <w:r>
-        <w:rPr>
-          <w:b/>
-          <w:color w:val="1F2328"/>
-          <w:sz w:val="19"/>
-        </w:rPr>
         <w:t xml:space="preserve">PSI — Adattamento dinamico forzato del contenuto:  </w:t>
       </w:r>
       <w:r>

</xml_diff>